<commit_message>
feat: enrich disease JSON meta, paper v6, figures, and rejection inquiry
Phase 1 enrichment:
- data/ode_diseases.json: add meta field (references, labels, equations)
  to all 17 diseases via enrich_disease_meta.py
- data/ode_diseases_schema.json: JSON Schema for disease definitions
- tools/dev/enrich_disease_meta.py: CLI to safely re-enrich disease JSON

Paper (SIMULATION rejection response):
- papers/gauss_seidel_baroreflex/rejection_inquiry.md: inquiry letter to editor
- papers/gauss_seidel_baroreflex/manuscript_v6.md: revised manuscript draft
- papers/gauss_seidel_baroreflex/make_fig*.py: figure generation scripts
- papers/gauss_seidel_baroreflex/figure_prompts.md: figure prompts
- papers/gauss_seidel_baroreflex/figures_all.drawio: architecture diagrams

Experiments:
- experiments/exp9_abc_isolation.py, exp9_runner.py, exp9_abc_results.json
- experiments/exp6_results.json
</commit_message>
<xml_diff>
--- a/papers/gauss_seidel_baroreflex/manuscript_v5.docx
+++ b/papers/gauss_seidel_baroreflex/manuscript_v5.docx
@@ -7,22 +7,58 @@
         <w:pStyle w:val="Heading1"/>
       </w:pPr>
       <w:r>
-        <w:t>Spurious Steady State from a dt-Dimensional Mismatch in FactorCommand Events: A Canine Cardiovascular Case Study</w:t>
+        <w:t>TITLE PAGE</w:t>
+      </w:r>
+    </w:p>
+    <w:p>
+      <w:pPr>
+        <w:pStyle w:val="Heading2"/>
+      </w:pPr>
+      <w:r>
+        <w:t>Spurious Steady State from dt-Dimensional Ambiguity in Modular ODE Coupling: A Failure Mode, Detection Protocol, and Cardiovascular Demonstration</w:t>
       </w:r>
     </w:p>
     <w:p>
       <w:r>
-        <w:t>Authors: [Author list]</w:t>
+        <w:t>Author: Yibo Wang</w:t>
       </w:r>
     </w:p>
     <w:p>
       <w:r>
-        <w:t>Corresponding: [Email]</w:t>
+        <w:t>Affiliation: College of Animal Sciences, Zhejiang University, Hangzhou, China</w:t>
+      </w:r>
+    </w:p>
+    <w:p>
+      <w:r>
+        <w:t>Corresponding author: Wang Yibo, &lt;3230100266@zju.edu.cn&gt;</w:t>
       </w:r>
     </w:p>
     <w:p>
       <w:r>
         <w:t>Keywords: modular ODE simulation, sequential Euler coupling, discrete event, dimensional analysis, spurious steady state, baroreflex, cardiovascular modeling</w:t>
+      </w:r>
+    </w:p>
+    <w:p>
+      <w:r>
+        <w:t>Author Contributions: Conceptualization, Methodology, Software, Investigation, Validation, Writing — Original Draft, Writing — Review &amp; Editing.</w:t>
+      </w:r>
+    </w:p>
+    <w:p>
+      <w:r>
+        <w:t>Competing interests: None declared.</w:t>
+      </w:r>
+    </w:p>
+    <w:p>
+      <w:r>
+        <w:br w:type="page"/>
+      </w:r>
+    </w:p>
+    <w:p>
+      <w:pPr>
+        <w:pStyle w:val="Heading1"/>
+      </w:pPr>
+      <w:r>
+        <w:t>Spurious Steady State from dt-Dimensional Ambiguity in Modular ODE Coupling: A Failure Mode, Detection Protocol, and Cardiovascular Demonstration</w:t>
       </w:r>
     </w:p>
     <w:p>
@@ -35,7 +71,7 @@
     </w:p>
     <w:p>
       <w:r>
-        <w:t>Multi-organ physiological simulators commonly couple organ modules through threshold-gated discrete events that modify shared state variables. Using an 11-organ canine cardiovascular simulation as a testbed, we report the discovery, diagnosis, and correction of a dimensional analysis error in such a discrete event system: a heart rate modifier was implemented as a fixed increment per time step (bpm/step) rather than as a time-normalized rate (bpm/s). At fine integration steps (dt = 0.001 s), this produced an effective HR injection rate of 10,000 bpm/s — 1,000 times the intended magnitude. The resulting steady-state MAP bias reached +44.7 mmHg before heart rate saturated at its physiological ceiling of 180 bpm. The system converged to a stable steady state, but at a physiologically wrong operating point — a failure mode we term spurious steady state. Standard convergence diagnostics (dt refinement, steady-state detection, parameter sweeps) detected the anomaly but misidentified it as physiological saturation. Correction required 7 lines of code: scaling discrete deltas by dt on emission, eliminating a redundant parallel path, and applying exponential rate conversion to the SVR-multiply channel. Post-fix MAP variance across a dt sweep (0.1–0.001 s) fell from 44.7 mmHg to ≤2.21 mmHg. This case study documents one specific instance in one simulation engine (Virtual Vet); whether this failure pattern recurs in other platforms requires systematic investigation. The findings alert developers of threshold-gated discrete event architectures to a latent dimensional inconsistency that routine numerical verification may miss.</w:t>
+        <w:t>Multi-organ physiological simulators commonly couple organ modules through threshold-gated discrete events that modify shared state variables. We characterize spurious steady state — a failure mode in which such events carry a dt-dimensional ambiguity (increment per step vs rate per second), producing a stable but incorrect steady state that standard convergence diagnostics cannot detect. Using an 11-organ canine cardiovascular simulation as a demonstrative testbed, we trace one instance: a heart rate modifier implemented as a fixed increment per time step (bpm/step) rather than as a time-normalized rate (bpm/s). At fine integration steps (dt = 0.001 s), this produced an effective HR injection rate of 10,000 bpm/s — 1,000 times the intended magnitude. The resulting steady-state MAP bias reached +44.7 mmHg before heart rate saturated at its physiological ceiling of 180 bpm. Standard convergence diagnostics (dt refinement, steady-state detection, parameter sweeps) detected the anomaly but misidentified it as physiological saturation. Correction required three changes across production files (7 lines total): scaling discrete deltas by dt on emission, eliminating a redundant parallel path, and applying exponential rate conversion to the SVR-multiply channel. Post-fix MAP range across a dt sweep (0.1–0.001 s) fell from 33.7 mmHg to ≤0.51 mmHg at DC=10. A minimal 2-variable toy model — containing no physiological parameters — reproduces the entire bias pattern, suggesting the failure mode is intrinsic to the coupling design rather than contingent on cardiovascular physiology. The findings alert developers of threshold-gated discrete event architectures to a latent dimensional inconsistency that routine numerical verification may miss.</w:t>
       </w:r>
     </w:p>
     <w:p>
@@ -48,22 +84,22 @@
     </w:p>
     <w:p>
       <w:r>
-        <w:t>Physiological simulation platforms such as HumMod, SAPHIR, and CellML-based frameworks now support applications from classroom teaching to drug interaction modeling [Ottesen et al., 2004]. In practice, many of these engines couple 10 or more organ modules with heterogeneous time constants through shared state variables. Sequential explicit Euler integration is frequently chosen because it permits per-module debugging, supports heterogeneous time steps without matrix assembly, and avoids the overhead of implicit solver infrastructure.</w:t>
+        <w:t>Modular simulation architectures — in which autonomous subsystem modules communicate through shared state variables — are a dominant design pattern across domains from physiological modeling [1] to multi-physics co-simulation [2]. In such architectures, a common inter-module communication mechanism is the threshold-gated discrete event: Module A monitors a state variable, and when a threshold is crossed, emits an event that modifies a state variable in Module B. This pattern appears in physiological engines (e.g., baroreflex-mediated heart rate adjustment), robotic control systems (e.g., sensor-triggered actuator commands), and discrete-event simulation frameworks (e.g., DEVS-based coupling [3]). When the receiving module integrates its dynamics with explicit Euler, the event's dimensional interpretation — whether it represents a rate (per-second) or a fixed increment (per-step) — becomes critical.</w:t>
       </w:r>
     </w:p>
     <w:p>
       <w:r>
-        <w:t>Several groups have documented the numerical challenges of closed-loop cardiovascular simulation. van Osta et al. (2025) demonstrated that closed-loop regulation substantially extends equilibration time in zero-dimensional cardiovascular models compared to open-loop configurations. Tłałka et al. (2024) identified stability concerns with explicit integration in baroreflex-coupled models, motivating the use of implicit or semi-implicit schemes. Ursino (1998), in his foundational work on carotid baroreflex modeling, employed implicit Gear-style solvers as a matter of course.</w:t>
+        <w:t>Several groups have documented the numerical challenges of closed-loop cardiovascular simulation. van Osta et al. [4] demonstrated that closed-loop regulation substantially extends equilibration time in zero-dimensional cardiovascular models compared to open-loop configurations. Tłałka et al. [5] identified stability concerns with explicit integration in baroreflex-coupled models, motivating the use of implicit or semi-implicit schemes. Ursino [6], in his foundational work on carotid baroreflex modeling, employed implicit Gear-style solvers as a matter of course.</w:t>
       </w:r>
     </w:p>
     <w:p>
       <w:r>
-        <w:t>Yet the specific failure mode of threshold-gated discrete inter-module events — a common design pattern in many simulation engines — has received little attention. In this pattern, Module A monitors a state variable, and when a threshold is exceeded, emits a discrete event that adds or multiplies a state variable in Module B. The question addressed here is simple: can a seemingly innocuous dimensional oversight in such discrete events produce a stable but physiologically wrong steady state that standard convergence checks do not detect?</w:t>
+        <w:t>Yet the specific failure mode of threshold-gated discrete inter-module events — a common design pattern in many simulation engines — has received little attention. In this pattern, Module A monitors a state variable, and when a threshold is exceeded, emits a discrete event that adds or multiplies a state variable in Module B. The question addressed here is simple: can a seemingly innocuous dt-dimensional ambiguity in such discrete events produce a stable but physiologically wrong steady state that standard convergence checks do not detect?</w:t>
       </w:r>
     </w:p>
     <w:p>
       <w:r>
-        <w:t>We answer this question using Virtual Vet, an 11-organ canine cardiovascular simulation platform. We document the complete journey: the anomalous dt-dependent bias that led to investigation, the exclusion of state pollution as a cause, the root cause identified through dimensional analysis of threshold-gated event emission, the 7-line fix, and a three-condition isolation experiment quantifying the independent contributions of each code change. The central contribution is a documented failure mode in this specific system — spurious steady state — where the modular ODE system converges to a stable steady state that is physiologically incorrect, without triggering any standard convergence warning.</w:t>
+        <w:t>We characterize spurious steady state: a failure mode in which modular ODE systems with threshold-gated discrete events converge to a stable but incorrect steady state while passing all standard convergence diagnostics. Using Virtual Vet — an 11-organ canine cardiovascular simulation — as a demonstrative testbed, we trace one instance through its discovery, root cause analysis, dimensional diagnosis, and four-condition isolation. We then generalize by (i) confirming the mechanism is intrinsic to the coupling pattern through a domain-independent toy model (Section 3.5), (ii) extracting a three-level detection protocol applicable to any modular simulation (Section 4.2), and (iii) proposing temporal type metadata for discrete-event interfaces — a dimension absent from existing coupling standards (Section 4.3).</w:t>
       </w:r>
     </w:p>
     <w:p>
@@ -109,12 +145,12 @@
     </w:p>
     <w:p>
       <w:r>
-        <w:t>This design ensures a uniform write interface across all physiological subsystems — baroreflex, diseases, drugs, and treatments all route through the same dispatch. The sequential step order is hard-coded: heart → lung → kidney → gut → liver → endocrine → neuro → immune → coagulation → lymphatic → fluid, executing each module's compute(dt, ...) method once per time step.</w:t>
+        <w:t>This design ensures a uniform write interface across all physiological subsystems — baroreflex, diseases, drugs, and treatments all route through the same dispatch. The sequential step order is hard-coded: heart → lung → kidney → gut → liver → endocrine → neuro → immune → coagulation → lymphatic → fluid, executing each module's compute(dt, ...) method once per time step using forward Euler integration [7].</w:t>
       </w:r>
     </w:p>
     <w:p>
       <w:r>
-        <w:t>Default integration parameters: dt = 0.01 s, body weight 20 kg, age 1095 days (adult canine).</w:t>
+        <w:t>Default integration parameters: dt = 0.01 s, body weight 20 kg, age 1095 days (adult canine). At baseline (DC = 25, no disease), the post-fix simulation produces MAP = 100.9 mmHg and HR = 108.5 bpm — within the normal canine resting range of MAP 85–120 mmHg and HR 60–140 bpm reported by VetFolio and Acierno et al. [8, 9].</w:t>
       </w:r>
     </w:p>
     <w:p>
@@ -221,7 +257,7 @@
     </w:p>
     <w:p>
       <w:r>
-        <w:t>- Exp6: Original (buggy) code — FC deltas unscaled by dt</w:t>
+        <w:t>- Exp6: Original (buggy) code — FactorCommand (FC) deltas unscaled by dt</w:t>
       </w:r>
     </w:p>
     <w:p>
@@ -236,7 +272,43 @@
     </w:p>
     <w:p>
       <w:r>
-        <w:t>Post-fix clinical validity was assessed against Tucker et al. (1984), which reported HR and MAP responses to graded hypoxia in conscious dogs.</w:t>
+        <w:t>Post-fix clinical validity was assessed against Tucker et al. [10], which reported HR and MAP responses to graded hypoxia in conscious dogs.</w:t>
+      </w:r>
+    </w:p>
+    <w:p>
+      <w:pPr>
+        <w:pStyle w:val="Heading3"/>
+      </w:pPr>
+      <w:r>
+        <w:t>2.5 Toy Model: Domain-Independent Minimal Demonstration</w:t>
+      </w:r>
+    </w:p>
+    <w:p>
+      <w:r>
+        <w:t>To confirm that the spurious steady state arises from the coupling pattern itself — not from cardiovascular physiology — we constructed a minimal 2-variable ODE system:</w:t>
+      </w:r>
+    </w:p>
+    <w:p>
+      <w:pPr>
+        <w:spacing w:line="240" w:lineRule="auto"/>
+      </w:pPr>
+      <w:r>
+        <w:rPr>
+          <w:rFonts w:ascii="Courier New" w:hAnsi="Courier New"/>
+          <w:sz w:val="18"/>
+        </w:rPr>
+        <w:t>Plant:       dx/dt = -k·(x − x₀)          [continuous homeostasis]</w:t>
+        <w:br/>
+        <w:t>Controller:  when sensor &gt; threshold  →  FC("x", "add", K)</w:t>
+        <w:br/>
+        <w:t xml:space="preserve">             BUGGY: K [unit/step]          FIXED: K·dt [unit/s]</w:t>
+        <w:br/>
+        <w:t>Saturation:  x ≤ x_ceiling                 [truncation ceiling]</w:t>
+      </w:r>
+    </w:p>
+    <w:p>
+      <w:r>
+        <w:t>The plant represents any continuous system maintaining a setpoint x₀ with relaxation rate k. The controller mimics threshold-gated discrete events: when an external signal exceeds threshold, it emits a fixed-magnitude event modifying x. No physiological assumptions are embedded — the parameters (k = 0.25, K = 0.5, x₀ = 100, x_ceiling = 180) were chosen purely to produce the same qualitative bias pattern as Virtual Vet for visual comparison.</w:t>
       </w:r>
     </w:p>
     <w:p>
@@ -257,7 +329,7 @@
     </w:p>
     <w:p>
       <w:r>
-        <w:t>Under the original code, a simple dt-sweep convergence study (DC=10, mild hypoxia) revealed a striking pattern: steady-state MAP increased systematically as dt decreased, reaching +44.7 mmHg above nominal by dt=0.02 s (Table 1).</w:t>
+        <w:t>Under the original code, a simple dt-sweep convergence study [11] (DC=10, moderate hypoxia) revealed a striking pattern: steady-state MAP increased systematically as dt decreased, reaching +44.7 mmHg above nominal by dt=0.02 s (Table 1).</w:t>
       </w:r>
     </w:p>
     <w:p>
@@ -758,12 +830,17 @@
     </w:tbl>
     <w:p>
       <w:r>
-        <w:t>The pattern is striking for two reasons. First, the bias increases as dt decreases — the opposite of what is expected from truncation error, which scales as O(dt) for explicit Euler. Second, below dt ≈ 0.02 s, the system plateaus at a precisely constant value. The product bias × dt in the unsaturated regime is nearly constant (1.14 ± 0.04), implying bias ∝ 1/dt.</w:t>
+        <w:t>The pattern is striking for two reasons. First, the bias increases as dt decreases — the opposite of what is expected from truncation error, which scales as O(dt) for explicit Euler [7]. Second, below dt ≈ 0.02 s, the system plateaus at a precisely constant value. The product bias × dt in the unsaturated regime is nearly constant (1.14 ± 0.04), implying bias ∝ 1/dt. Figure 2 shows this MAP bias vs dt relationship across the full dt sweep on both log-log and semilog scales, revealing the unsaturated drift regime and the saturated plateau.</w:t>
       </w:r>
     </w:p>
     <w:p>
       <w:r>
-        <w:t>This behavior superficially resembles the fixed-point destabilization described in sequential coupled analyses [Kim et al., 2011], and we initially pursued this explanation. However, the parameter insensitivity of the bias — identical across baroreflex gains from 0.5× to 8.0×, MAP initializations, and body masses — suggested a mechanism more fundamental than gain-mediated instability.</w:t>
+        <w:t>The strict constancy of MAP in the saturated regime (144.7 mmHg across dt = 0.02 to 0.001 s) reflects the compounding effect of the HR ceiling on cardiac output: when HR = 180 bpm (the physiological ceiling), CO = HR × SV is similarly capped, and MAP = CO × SVR then inherits this saturation through the circulation. Once both HR and CO saturate, further dt reduction cannot increase MAP further.</w:t>
+      </w:r>
+    </w:p>
+    <w:p>
+      <w:r>
+        <w:t>This behavior superficially resembles the fixed-point destabilization described in sequential coupled analyses [12], and we initially pursued this explanation — noting, however, that Kim's framework addresses operator splitting in coupled PDE systems (poromechanics), not discrete inter-module events in modular ODE engines, so the analogy is heuristic rather than formally applicable. The parameter insensitivity of the bias — identical across baroreflex gains from 0.5× to 8.0×, MAP initializations, and body masses — suggested a mechanism more fundamental than gain-mediated instability.</w:t>
       </w:r>
     </w:p>
     <w:p>
@@ -948,7 +1025,7 @@
     </w:p>
     <w:p>
       <w:r>
-        <w:t>The value net_HR_add had units of bpm/step — but this was not apparent from the code, since the variable was computed from dimensionless products like chemoreceptor_drive × 10.0. The continuous baroreflex path in heart.py, by contrast, explicitly multiplied by dt.</w:t>
+        <w:t>The value net_HR_add had units of bpm/step — but this was not apparent from the code, since the variable was computed from dimensionless products like chemoreceptor_drive × 10.0. The continuous baroreflex path in heart.py, by contrast, explicitly multiplied by dt (cf. the approach of Ursino [6]).</w:t>
       </w:r>
     </w:p>
     <w:p>
@@ -1005,7 +1082,7 @@
     </w:p>
     <w:p>
       <w:r>
-        <w:t>The redundancy had masked the bug: when chemoreflex was withdrawn from either path alone, the other path continued to provide drive, making the effect of the dimensional error less obvious in isolated testing.</w:t>
+        <w:t>The redundancy had masked the bug: when chemoreflex was withdrawn from either path alone, the other path continued to provide drive, making the effect of the dimensional error less obvious in isolated testing. Table 2 summarizes the root cause analysis.</w:t>
       </w:r>
     </w:p>
     <w:p>
@@ -1207,7 +1284,7 @@
     </w:p>
     <w:p>
       <w:r>
-        <w:t>The 7-line fix comprises two independent corrections:</w:t>
+        <w:t>The 7-line fix comprises three independent corrections:</w:t>
       </w:r>
     </w:p>
     <w:p>
@@ -1227,7 +1304,12 @@
     </w:p>
     <w:p>
       <w:r>
-        <w:t>To determine their independent contributions, we conducted a three-condition isolation experiment using subprocess-isolated runs:</w:t>
+        <w:t>Figure 3 shows the complete code diff for all three changes.</w:t>
+      </w:r>
+    </w:p>
+    <w:p>
+      <w:r>
+        <w:t>To determine their independent contributions, we conducted a four-condition isolation experiment using subprocess-isolated runs. Because the path consolidation (B) also changed the chemo gain constant (10 bpm/s on the FC path vs 15 bpm/s on the continuous path), a fourth condition W disambiguates the confound:</w:t>
       </w:r>
     </w:p>
     <w:p>
@@ -1242,7 +1324,12 @@
     </w:p>
     <w:p>
       <w:r>
-        <w:t>- Z (A+B, current): FC × dt, chemo excluded, continuous path active</w:t>
+        <w:t>- W (A+path, gain=10): FC × dt, chemo excluded, continuous path active (gain=10)</w:t>
+      </w:r>
+    </w:p>
+    <w:p>
+      <w:r>
+        <w:t>- Z (A+B, current): FC × dt, chemo excluded, continuous path active (gain=15)</w:t>
       </w:r>
     </w:p>
     <w:p>
@@ -1250,7 +1337,7 @@
         <w:rPr>
           <w:b/>
         </w:rPr>
-        <w:t>Table 3: Three-condition isolation — MAP range across dt sweep (mmHg)</w:t>
+        <w:t>Table 3: Four-condition isolation — MAP range across dt sweep (mmHg)</w:t>
       </w:r>
     </w:p>
     <w:tbl>
@@ -1260,20 +1347,19 @@
         <w:tblLook w:firstColumn="1" w:firstRow="1" w:lastColumn="0" w:lastRow="0" w:noHBand="0" w:noVBand="1" w:val="04A0"/>
       </w:tblPr>
       <w:tblGrid>
-        <w:gridCol w:w="1040"/>
-        <w:gridCol w:w="1040"/>
-        <w:gridCol w:w="1040"/>
-        <w:gridCol w:w="1040"/>
-        <w:gridCol w:w="1040"/>
-        <w:gridCol w:w="1040"/>
-        <w:gridCol w:w="1040"/>
-        <w:gridCol w:w="1040"/>
-        <w:gridCol w:w="1040"/>
+        <w:gridCol w:w="1170"/>
+        <w:gridCol w:w="1170"/>
+        <w:gridCol w:w="1170"/>
+        <w:gridCol w:w="1170"/>
+        <w:gridCol w:w="1170"/>
+        <w:gridCol w:w="1170"/>
+        <w:gridCol w:w="1170"/>
+        <w:gridCol w:w="1170"/>
       </w:tblGrid>
       <w:tr>
         <w:tc>
           <w:tcPr>
-            <w:tcW w:type="dxa" w:w="1040"/>
+            <w:tcW w:type="dxa" w:w="1170"/>
           </w:tcPr>
           <w:p>
             <w:r>
@@ -1287,7 +1373,7 @@
         </w:tc>
         <w:tc>
           <w:tcPr>
-            <w:tcW w:type="dxa" w:w="1040"/>
+            <w:tcW w:type="dxa" w:w="1170"/>
           </w:tcPr>
           <w:p>
             <w:r>
@@ -1301,21 +1387,7 @@
         </w:tc>
         <w:tc>
           <w:tcPr>
-            <w:tcW w:type="dxa" w:w="1040"/>
-          </w:tcPr>
-          <w:p>
-            <w:r>
-              <w:rPr>
-                <w:b/>
-                <w:sz w:val="20"/>
-              </w:rPr>
-              <w:t>X_last</w:t>
-            </w:r>
-          </w:p>
-        </w:tc>
-        <w:tc>
-          <w:tcPr>
-            <w:tcW w:type="dxa" w:w="1040"/>
+            <w:tcW w:type="dxa" w:w="1170"/>
           </w:tcPr>
           <w:p>
             <w:r>
@@ -1329,7 +1401,7 @@
         </w:tc>
         <w:tc>
           <w:tcPr>
-            <w:tcW w:type="dxa" w:w="1040"/>
+            <w:tcW w:type="dxa" w:w="1170"/>
           </w:tcPr>
           <w:p>
             <w:r>
@@ -1337,13 +1409,13 @@
                 <w:b/>
                 <w:sz w:val="20"/>
               </w:rPr>
-              <w:t>Y_last</w:t>
+              <w:t>W_range</w:t>
             </w:r>
           </w:p>
         </w:tc>
         <w:tc>
           <w:tcPr>
-            <w:tcW w:type="dxa" w:w="1040"/>
+            <w:tcW w:type="dxa" w:w="1170"/>
           </w:tcPr>
           <w:p>
             <w:r>
@@ -1357,21 +1429,7 @@
         </w:tc>
         <w:tc>
           <w:tcPr>
-            <w:tcW w:type="dxa" w:w="1040"/>
-          </w:tcPr>
-          <w:p>
-            <w:r>
-              <w:rPr>
-                <w:b/>
-                <w:sz w:val="20"/>
-              </w:rPr>
-              <w:t>Z_last</w:t>
-            </w:r>
-          </w:p>
-        </w:tc>
-        <w:tc>
-          <w:tcPr>
-            <w:tcW w:type="dxa" w:w="1040"/>
+            <w:tcW w:type="dxa" w:w="1170"/>
           </w:tcPr>
           <w:p>
             <w:r>
@@ -1385,7 +1443,7 @@
         </w:tc>
         <w:tc>
           <w:tcPr>
-            <w:tcW w:type="dxa" w:w="1040"/>
+            <w:tcW w:type="dxa" w:w="1170"/>
           </w:tcPr>
           <w:p>
             <w:r>
@@ -1397,11 +1455,25 @@
             </w:r>
           </w:p>
         </w:tc>
+        <w:tc>
+          <w:tcPr>
+            <w:tcW w:type="dxa" w:w="1170"/>
+          </w:tcPr>
+          <w:p>
+            <w:r>
+              <w:rPr>
+                <w:b/>
+                <w:sz w:val="20"/>
+              </w:rPr>
+              <w:t>C_contrib</w:t>
+            </w:r>
+          </w:p>
+        </w:tc>
       </w:tr>
       <w:tr>
         <w:tc>
           <w:tcPr>
-            <w:tcW w:type="dxa" w:w="1040"/>
+            <w:tcW w:type="dxa" w:w="1170"/>
           </w:tcPr>
           <w:p>
             <w:r>
@@ -1414,7 +1486,7 @@
         </w:tc>
         <w:tc>
           <w:tcPr>
-            <w:tcW w:type="dxa" w:w="1040"/>
+            <w:tcW w:type="dxa" w:w="1170"/>
           </w:tcPr>
           <w:p>
             <w:r>
@@ -1427,20 +1499,7 @@
         </w:tc>
         <w:tc>
           <w:tcPr>
-            <w:tcW w:type="dxa" w:w="1040"/>
-          </w:tcPr>
-          <w:p>
-            <w:r>
-              <w:rPr>
-                <w:sz w:val="20"/>
-              </w:rPr>
-              <w:t>100.92</w:t>
-            </w:r>
-          </w:p>
-        </w:tc>
-        <w:tc>
-          <w:tcPr>
-            <w:tcW w:type="dxa" w:w="1040"/>
+            <w:tcW w:type="dxa" w:w="1170"/>
           </w:tcPr>
           <w:p>
             <w:r>
@@ -1453,20 +1512,20 @@
         </w:tc>
         <w:tc>
           <w:tcPr>
-            <w:tcW w:type="dxa" w:w="1040"/>
+            <w:tcW w:type="dxa" w:w="1170"/>
           </w:tcPr>
           <w:p>
             <w:r>
               <w:rPr>
                 <w:sz w:val="20"/>
               </w:rPr>
-              <w:t>100.92</w:t>
+              <w:t>0.27</w:t>
             </w:r>
           </w:p>
         </w:tc>
         <w:tc>
           <w:tcPr>
-            <w:tcW w:type="dxa" w:w="1040"/>
+            <w:tcW w:type="dxa" w:w="1170"/>
           </w:tcPr>
           <w:p>
             <w:r>
@@ -1479,20 +1538,7 @@
         </w:tc>
         <w:tc>
           <w:tcPr>
-            <w:tcW w:type="dxa" w:w="1040"/>
-          </w:tcPr>
-          <w:p>
-            <w:r>
-              <w:rPr>
-                <w:sz w:val="20"/>
-              </w:rPr>
-              <w:t>101.08</w:t>
-            </w:r>
-          </w:p>
-        </w:tc>
-        <w:tc>
-          <w:tcPr>
-            <w:tcW w:type="dxa" w:w="1040"/>
+            <w:tcW w:type="dxa" w:w="1170"/>
           </w:tcPr>
           <w:p>
             <w:r>
@@ -1505,14 +1551,27 @@
         </w:tc>
         <w:tc>
           <w:tcPr>
-            <w:tcW w:type="dxa" w:w="1040"/>
+            <w:tcW w:type="dxa" w:w="1170"/>
           </w:tcPr>
           <w:p>
             <w:r>
               <w:rPr>
                 <w:sz w:val="20"/>
               </w:rPr>
-              <w:t>−0.25</w:t>
+              <w:t>−0.17</w:t>
+            </w:r>
+          </w:p>
+        </w:tc>
+        <w:tc>
+          <w:tcPr>
+            <w:tcW w:type="dxa" w:w="1170"/>
+          </w:tcPr>
+          <w:p>
+            <w:r>
+              <w:rPr>
+                <w:sz w:val="20"/>
+              </w:rPr>
+              <w:t>−0.08</w:t>
             </w:r>
           </w:p>
         </w:tc>
@@ -1520,7 +1579,7 @@
       <w:tr>
         <w:tc>
           <w:tcPr>
-            <w:tcW w:type="dxa" w:w="1040"/>
+            <w:tcW w:type="dxa" w:w="1170"/>
           </w:tcPr>
           <w:p>
             <w:r>
@@ -1533,7 +1592,7 @@
         </w:tc>
         <w:tc>
           <w:tcPr>
-            <w:tcW w:type="dxa" w:w="1040"/>
+            <w:tcW w:type="dxa" w:w="1170"/>
           </w:tcPr>
           <w:p>
             <w:r>
@@ -1546,20 +1605,7 @@
         </w:tc>
         <w:tc>
           <w:tcPr>
-            <w:tcW w:type="dxa" w:w="1040"/>
-          </w:tcPr>
-          <w:p>
-            <w:r>
-              <w:rPr>
-                <w:sz w:val="20"/>
-              </w:rPr>
-              <w:t>98.42</w:t>
-            </w:r>
-          </w:p>
-        </w:tc>
-        <w:tc>
-          <w:tcPr>
-            <w:tcW w:type="dxa" w:w="1040"/>
+            <w:tcW w:type="dxa" w:w="1170"/>
           </w:tcPr>
           <w:p>
             <w:r>
@@ -1572,20 +1618,20 @@
         </w:tc>
         <w:tc>
           <w:tcPr>
-            <w:tcW w:type="dxa" w:w="1040"/>
+            <w:tcW w:type="dxa" w:w="1170"/>
           </w:tcPr>
           <w:p>
             <w:r>
               <w:rPr>
                 <w:sz w:val="20"/>
               </w:rPr>
-              <w:t>98.42</w:t>
+              <w:t>2.70</w:t>
             </w:r>
           </w:p>
         </w:tc>
         <w:tc>
           <w:tcPr>
-            <w:tcW w:type="dxa" w:w="1040"/>
+            <w:tcW w:type="dxa" w:w="1170"/>
           </w:tcPr>
           <w:p>
             <w:r>
@@ -1598,20 +1644,7 @@
         </w:tc>
         <w:tc>
           <w:tcPr>
-            <w:tcW w:type="dxa" w:w="1040"/>
-          </w:tcPr>
-          <w:p>
-            <w:r>
-              <w:rPr>
-                <w:sz w:val="20"/>
-              </w:rPr>
-              <w:t>98.47</w:t>
-            </w:r>
-          </w:p>
-        </w:tc>
-        <w:tc>
-          <w:tcPr>
-            <w:tcW w:type="dxa" w:w="1040"/>
+            <w:tcW w:type="dxa" w:w="1170"/>
           </w:tcPr>
           <w:p>
             <w:r>
@@ -1624,14 +1657,27 @@
         </w:tc>
         <w:tc>
           <w:tcPr>
-            <w:tcW w:type="dxa" w:w="1040"/>
+            <w:tcW w:type="dxa" w:w="1170"/>
           </w:tcPr>
           <w:p>
             <w:r>
               <w:rPr>
                 <w:sz w:val="20"/>
               </w:rPr>
-              <w:t>−0.28</w:t>
+              <w:t>−0.19</w:t>
+            </w:r>
+          </w:p>
+        </w:tc>
+        <w:tc>
+          <w:tcPr>
+            <w:tcW w:type="dxa" w:w="1170"/>
+          </w:tcPr>
+          <w:p>
+            <w:r>
+              <w:rPr>
+                <w:sz w:val="20"/>
+              </w:rPr>
+              <w:t>−0.09</w:t>
             </w:r>
           </w:p>
         </w:tc>
@@ -1639,7 +1685,7 @@
       <w:tr>
         <w:tc>
           <w:tcPr>
-            <w:tcW w:type="dxa" w:w="1040"/>
+            <w:tcW w:type="dxa" w:w="1170"/>
           </w:tcPr>
           <w:p>
             <w:r>
@@ -1652,7 +1698,7 @@
         </w:tc>
         <w:tc>
           <w:tcPr>
-            <w:tcW w:type="dxa" w:w="1040"/>
+            <w:tcW w:type="dxa" w:w="1170"/>
           </w:tcPr>
           <w:p>
             <w:r>
@@ -1665,20 +1711,7 @@
         </w:tc>
         <w:tc>
           <w:tcPr>
-            <w:tcW w:type="dxa" w:w="1040"/>
-          </w:tcPr>
-          <w:p>
-            <w:r>
-              <w:rPr>
-                <w:sz w:val="20"/>
-              </w:rPr>
-              <w:t>139.29</w:t>
-            </w:r>
-          </w:p>
-        </w:tc>
-        <w:tc>
-          <w:tcPr>
-            <w:tcW w:type="dxa" w:w="1040"/>
+            <w:tcW w:type="dxa" w:w="1170"/>
           </w:tcPr>
           <w:p>
             <w:r>
@@ -1691,20 +1724,20 @@
         </w:tc>
         <w:tc>
           <w:tcPr>
-            <w:tcW w:type="dxa" w:w="1040"/>
+            <w:tcW w:type="dxa" w:w="1170"/>
           </w:tcPr>
           <w:p>
             <w:r>
               <w:rPr>
                 <w:sz w:val="20"/>
               </w:rPr>
-              <w:t>101.68</w:t>
+              <w:t>0.37</w:t>
             </w:r>
           </w:p>
         </w:tc>
         <w:tc>
           <w:tcPr>
-            <w:tcW w:type="dxa" w:w="1040"/>
+            <w:tcW w:type="dxa" w:w="1170"/>
           </w:tcPr>
           <w:p>
             <w:r>
@@ -1717,20 +1750,7 @@
         </w:tc>
         <w:tc>
           <w:tcPr>
-            <w:tcW w:type="dxa" w:w="1040"/>
-          </w:tcPr>
-          <w:p>
-            <w:r>
-              <w:rPr>
-                <w:sz w:val="20"/>
-              </w:rPr>
-              <w:t>102.26</w:t>
-            </w:r>
-          </w:p>
-        </w:tc>
-        <w:tc>
-          <w:tcPr>
-            <w:tcW w:type="dxa" w:w="1040"/>
+            <w:tcW w:type="dxa" w:w="1170"/>
           </w:tcPr>
           <w:p>
             <w:r>
@@ -1743,14 +1763,27 @@
         </w:tc>
         <w:tc>
           <w:tcPr>
-            <w:tcW w:type="dxa" w:w="1040"/>
+            <w:tcW w:type="dxa" w:w="1170"/>
           </w:tcPr>
           <w:p>
             <w:r>
               <w:rPr>
                 <w:sz w:val="20"/>
               </w:rPr>
-              <w:t>−0.10</w:t>
+              <w:t>0.03</w:t>
+            </w:r>
+          </w:p>
+        </w:tc>
+        <w:tc>
+          <w:tcPr>
+            <w:tcW w:type="dxa" w:w="1170"/>
+          </w:tcPr>
+          <w:p>
+            <w:r>
+              <w:rPr>
+                <w:sz w:val="20"/>
+              </w:rPr>
+              <w:t>−0.14</w:t>
             </w:r>
           </w:p>
         </w:tc>
@@ -1758,7 +1791,7 @@
       <w:tr>
         <w:tc>
           <w:tcPr>
-            <w:tcW w:type="dxa" w:w="1040"/>
+            <w:tcW w:type="dxa" w:w="1170"/>
           </w:tcPr>
           <w:p>
             <w:r>
@@ -1771,7 +1804,7 @@
         </w:tc>
         <w:tc>
           <w:tcPr>
-            <w:tcW w:type="dxa" w:w="1040"/>
+            <w:tcW w:type="dxa" w:w="1170"/>
           </w:tcPr>
           <w:p>
             <w:r>
@@ -1784,20 +1817,7 @@
         </w:tc>
         <w:tc>
           <w:tcPr>
-            <w:tcW w:type="dxa" w:w="1040"/>
-          </w:tcPr>
-          <w:p>
-            <w:r>
-              <w:rPr>
-                <w:sz w:val="20"/>
-              </w:rPr>
-              <w:t>144.59</w:t>
-            </w:r>
-          </w:p>
-        </w:tc>
-        <w:tc>
-          <w:tcPr>
-            <w:tcW w:type="dxa" w:w="1040"/>
+            <w:tcW w:type="dxa" w:w="1170"/>
           </w:tcPr>
           <w:p>
             <w:r>
@@ -1810,20 +1830,20 @@
         </w:tc>
         <w:tc>
           <w:tcPr>
-            <w:tcW w:type="dxa" w:w="1040"/>
+            <w:tcW w:type="dxa" w:w="1170"/>
           </w:tcPr>
           <w:p>
             <w:r>
               <w:rPr>
                 <w:sz w:val="20"/>
               </w:rPr>
-              <w:t>103.89</w:t>
+              <w:t>2.20</w:t>
             </w:r>
           </w:p>
         </w:tc>
         <w:tc>
           <w:tcPr>
-            <w:tcW w:type="dxa" w:w="1040"/>
+            <w:tcW w:type="dxa" w:w="1170"/>
           </w:tcPr>
           <w:p>
             <w:r>
@@ -1836,20 +1856,7 @@
         </w:tc>
         <w:tc>
           <w:tcPr>
-            <w:tcW w:type="dxa" w:w="1040"/>
-          </w:tcPr>
-          <w:p>
-            <w:r>
-              <w:rPr>
-                <w:sz w:val="20"/>
-              </w:rPr>
-              <w:t>105.58</w:t>
-            </w:r>
-          </w:p>
-        </w:tc>
-        <w:tc>
-          <w:tcPr>
-            <w:tcW w:type="dxa" w:w="1040"/>
+            <w:tcW w:type="dxa" w:w="1170"/>
           </w:tcPr>
           <w:p>
             <w:r>
@@ -1862,7 +1869,20 @@
         </w:tc>
         <w:tc>
           <w:tcPr>
-            <w:tcW w:type="dxa" w:w="1040"/>
+            <w:tcW w:type="dxa" w:w="1170"/>
+          </w:tcPr>
+          <w:p>
+            <w:r>
+              <w:rPr>
+                <w:sz w:val="20"/>
+              </w:rPr>
+              <w:t>−0.00</w:t>
+            </w:r>
+          </w:p>
+        </w:tc>
+        <w:tc>
+          <w:tcPr>
+            <w:tcW w:type="dxa" w:w="1170"/>
           </w:tcPr>
           <w:p>
             <w:r>
@@ -1877,27 +1897,22 @@
     </w:tbl>
     <w:p>
       <w:r>
-        <w:t>A_contrib = X_range − Y_range; B_contrib = Y_range − Z_range.</w:t>
+        <w:t>A_contrib = X_range − Y_range; B_contrib = Y_range − W_range; C_contrib = W_range − Z_range. Table 3 summarizes the four-condition isolation results across all DC values.</w:t>
       </w:r>
     </w:p>
     <w:p>
       <w:r>
-        <w:t>Under mild conditions (DC ≥ 15), all three conditions converge to essentially the same result because chemoreceptor drive is near zero — there is no excess HR drive to be injected, so the dt-dependent bias does not manifest regardless of the code path.</w:t>
+        <w:t>Under mild conditions (DC ≥ 15), all four conditions converge to essentially the same result because chemoreceptor drive is near zero — there is no excess HR drive to be injected, so the dt-dependent bias does not manifest regardless of the code path.</w:t>
       </w:r>
     </w:p>
     <w:p>
       <w:r>
-        <w:t>Under moderate and severe hypoxia (DC = 10, 5), the picture is clear: Operation A alone accounts for nearly all of the improvement. Removing the FC dt-dependency (Y) reduces the MAP range from 31.99 mmHg to 0.41 mmHg at DC=10. Operation B (adding the continuous chemo path) does not provide further correction — in fact, it slightly increases the MAP range by 0.10 mmHg at DC=10.</w:t>
+        <w:t>Under moderate and severe hypoxia (DC = 10, 5), the picture is clear: Operation A alone accounts for all of the improvement. Removing the FC dt-dependency (Y) reduces the MAP range from 31.99 mmHg to 0.41 mmHg at DC=10. The fourth condition W resolves the gain confound: B_contrib (path consolidation alone, same gain constant) is 0.03 mmHg — confirming the architectural change has no effect on MAP range. C_contrib (gain change 10→15) is −0.14 mmHg, reflecting a slightly larger MAP range at the higher gain. Neither is material (&lt; 0.2 mmHg).</w:t>
       </w:r>
     </w:p>
     <w:p>
       <w:r>
-        <w:t>The reason is subtle but mechanistically clear: the continuous chemo path adds an independent chemo-HR effect (~1–2 bpm at DC=5) that the original FC-only system did not have. This additional drive causes a small but measurable upward shift in steady-state MAP, which registers as a slightly larger range across the dt sweep.</w:t>
-      </w:r>
-    </w:p>
-    <w:p>
-      <w:r>
-        <w:t>Practical implication: The optimal configuration is A-only without B — FC dt-scaling alone fixes the bias with physiologically correct magnitudes. The continuous chemo path, while dimensionally correct and physiologically motivated, is not necessary for the bias correction and slightly increases MAP range. However, it does improve physiological plausibility: at DC=5, HR rises to 96.9 bpm (Z) vs 93.3 bpm (Y), closer to the +8 bpm increase reported by Tucker et al. (1984) for severe canine hypoxia.</w:t>
+        <w:t>Practical implication: The optimal configuration is A-only without B — FC dt-scaling alone fixes the bias with physiologically correct magnitudes. The continuous chemo path, while dimensionally correct and physiologically motivated, is not necessary for the bias elimination and slightly increases MAP range. However, it does improve physiological plausibility: at DC=5, HR rises to 96.9 bpm (Z) vs 93.3 bpm (Y), closer to the +8 bpm increase reported by Tucker et al. [10] for severe canine hypoxia.</w:t>
       </w:r>
     </w:p>
     <w:p>
@@ -1906,8 +1921,460 @@
       </w:r>
     </w:p>
     <w:p>
+      <w:pPr>
+        <w:pStyle w:val="Heading3"/>
+      </w:pPr>
       <w:r>
-        <w:t>Note on isolation design: Conditions Y and Z differ not only in the path consolidation (B operation) but also in the chemo gain constant: the FC path uses chemo_HR_add = chemoreceptor_drive × 10.0, while the continuous path uses chemo_HR = chemoreceptor_drive × 15.0. The B_contrib metric therefore conflates the architectural change (path consolidation) with the gain difference (10 vs 15 bpm/s). A fourth isolation condition — Z with gain = 10.0 — would fully decouple these factors. This is a limitation of the current three-condition design, though it does not affect the primary conclusion that Operation A alone eliminates the dt-dependent bias.</w:t>
+        <w:t>3.5 Toy Model: Consistent with General Mechanism</w:t>
+      </w:r>
+    </w:p>
+    <w:p>
+      <w:r>
+        <w:t>To verify that the spurious steady state is not an artifact of cardiovascular physiology, we ran the minimal toy model (Section 2.5) under identical dt-sweep conditions. Table 4 compares the toy model results with the Virtual Vet data across the full dt sweep.</w:t>
+      </w:r>
+    </w:p>
+    <w:p>
+      <w:r>
+        <w:rPr>
+          <w:b/>
+        </w:rPr>
+        <w:t>Table 4: Toy model vs Virtual Vet — bias pattern comparison across dt sweep</w:t>
+      </w:r>
+    </w:p>
+    <w:tbl>
+      <w:tblPr>
+        <w:tblStyle w:val="TableGrid"/>
+        <w:tblW w:type="auto" w:w="0"/>
+        <w:tblLook w:firstColumn="1" w:firstRow="1" w:lastColumn="0" w:lastRow="0" w:noHBand="0" w:noVBand="1" w:val="04A0"/>
+      </w:tblPr>
+      <w:tblGrid>
+        <w:gridCol w:w="1560"/>
+        <w:gridCol w:w="1560"/>
+        <w:gridCol w:w="1560"/>
+        <w:gridCol w:w="1560"/>
+        <w:gridCol w:w="1560"/>
+        <w:gridCol w:w="1560"/>
+      </w:tblGrid>
+      <w:tr>
+        <w:tc>
+          <w:tcPr>
+            <w:tcW w:type="dxa" w:w="1560"/>
+          </w:tcPr>
+          <w:p>
+            <w:r>
+              <w:rPr>
+                <w:b/>
+                <w:sz w:val="20"/>
+              </w:rPr>
+              <w:t>dt (s)</w:t>
+            </w:r>
+          </w:p>
+        </w:tc>
+        <w:tc>
+          <w:tcPr>
+            <w:tcW w:type="dxa" w:w="1560"/>
+          </w:tcPr>
+          <w:p>
+            <w:r>
+              <w:rPr>
+                <w:b/>
+                <w:sz w:val="20"/>
+              </w:rPr>
+              <w:t>Toy buggy</w:t>
+            </w:r>
+          </w:p>
+        </w:tc>
+        <w:tc>
+          <w:tcPr>
+            <w:tcW w:type="dxa" w:w="1560"/>
+          </w:tcPr>
+          <w:p>
+            <w:r>
+              <w:rPr>
+                <w:b/>
+                <w:sz w:val="20"/>
+              </w:rPr>
+              <w:t>Toy fixed</w:t>
+            </w:r>
+          </w:p>
+        </w:tc>
+        <w:tc>
+          <w:tcPr>
+            <w:tcW w:type="dxa" w:w="1560"/>
+          </w:tcPr>
+          <w:p>
+            <w:r>
+              <w:rPr>
+                <w:b/>
+                <w:sz w:val="20"/>
+              </w:rPr>
+              <w:t>VT pre-fix (DC=10)</w:t>
+            </w:r>
+          </w:p>
+        </w:tc>
+        <w:tc>
+          <w:tcPr>
+            <w:tcW w:type="dxa" w:w="1560"/>
+          </w:tcPr>
+          <w:p>
+            <w:r>
+              <w:rPr>
+                <w:b/>
+                <w:sz w:val="20"/>
+              </w:rPr>
+              <w:t>VT post-fix</w:t>
+            </w:r>
+          </w:p>
+        </w:tc>
+        <w:tc>
+          <w:tcPr>
+            <w:tcW w:type="dxa" w:w="1560"/>
+          </w:tcPr>
+          <w:p>
+            <w:r>
+              <w:rPr>
+                <w:b/>
+                <w:sz w:val="20"/>
+              </w:rPr>
+              <w:t>Pattern</w:t>
+            </w:r>
+          </w:p>
+        </w:tc>
+      </w:tr>
+      <w:tr>
+        <w:tc>
+          <w:tcPr>
+            <w:tcW w:type="dxa" w:w="1560"/>
+          </w:tcPr>
+          <w:p>
+            <w:r>
+              <w:rPr>
+                <w:sz w:val="20"/>
+              </w:rPr>
+              <w:t>0.100</w:t>
+            </w:r>
+          </w:p>
+        </w:tc>
+        <w:tc>
+          <w:tcPr>
+            <w:tcW w:type="dxa" w:w="1560"/>
+          </w:tcPr>
+          <w:p>
+            <w:r>
+              <w:rPr>
+                <w:sz w:val="20"/>
+              </w:rPr>
+              <w:t>120.0</w:t>
+            </w:r>
+          </w:p>
+        </w:tc>
+        <w:tc>
+          <w:tcPr>
+            <w:tcW w:type="dxa" w:w="1560"/>
+          </w:tcPr>
+          <w:p>
+            <w:r>
+              <w:rPr>
+                <w:sz w:val="20"/>
+              </w:rPr>
+              <w:t>102.0</w:t>
+            </w:r>
+          </w:p>
+        </w:tc>
+        <w:tc>
+          <w:tcPr>
+            <w:tcW w:type="dxa" w:w="1560"/>
+          </w:tcPr>
+          <w:p>
+            <w:r>
+              <w:rPr>
+                <w:sz w:val="20"/>
+              </w:rPr>
+              <w:t>111.0</w:t>
+            </w:r>
+          </w:p>
+        </w:tc>
+        <w:tc>
+          <w:tcPr>
+            <w:tcW w:type="dxa" w:w="1560"/>
+          </w:tcPr>
+          <w:p>
+            <w:r>
+              <w:rPr>
+                <w:sz w:val="20"/>
+              </w:rPr>
+              <w:t>102.3</w:t>
+            </w:r>
+          </w:p>
+        </w:tc>
+        <w:tc>
+          <w:tcPr>
+            <w:tcW w:type="dxa" w:w="1560"/>
+          </w:tcPr>
+          <w:p>
+            <w:r>
+              <w:rPr>
+                <w:sz w:val="20"/>
+              </w:rPr>
+              <w:t>Bias ~ 1/dt</w:t>
+            </w:r>
+          </w:p>
+        </w:tc>
+      </w:tr>
+      <w:tr>
+        <w:tc>
+          <w:tcPr>
+            <w:tcW w:type="dxa" w:w="1560"/>
+          </w:tcPr>
+          <w:p>
+            <w:r>
+              <w:rPr>
+                <w:sz w:val="20"/>
+              </w:rPr>
+              <w:t>0.050</w:t>
+            </w:r>
+          </w:p>
+        </w:tc>
+        <w:tc>
+          <w:tcPr>
+            <w:tcW w:type="dxa" w:w="1560"/>
+          </w:tcPr>
+          <w:p>
+            <w:r>
+              <w:rPr>
+                <w:sz w:val="20"/>
+              </w:rPr>
+              <w:t>140.0</w:t>
+            </w:r>
+          </w:p>
+        </w:tc>
+        <w:tc>
+          <w:tcPr>
+            <w:tcW w:type="dxa" w:w="1560"/>
+          </w:tcPr>
+          <w:p>
+            <w:r>
+              <w:rPr>
+                <w:sz w:val="20"/>
+              </w:rPr>
+              <w:t>102.0</w:t>
+            </w:r>
+          </w:p>
+        </w:tc>
+        <w:tc>
+          <w:tcPr>
+            <w:tcW w:type="dxa" w:w="1560"/>
+          </w:tcPr>
+          <w:p>
+            <w:r>
+              <w:rPr>
+                <w:sz w:val="20"/>
+              </w:rPr>
+              <w:t>121.1</w:t>
+            </w:r>
+          </w:p>
+        </w:tc>
+        <w:tc>
+          <w:tcPr>
+            <w:tcW w:type="dxa" w:w="1560"/>
+          </w:tcPr>
+          <w:p>
+            <w:r>
+              <w:rPr>
+                <w:sz w:val="20"/>
+              </w:rPr>
+              <w:t>102.3</w:t>
+            </w:r>
+          </w:p>
+        </w:tc>
+        <w:tc>
+          <w:tcPr>
+            <w:tcW w:type="dxa" w:w="1560"/>
+          </w:tcPr>
+          <w:p>
+            <w:r>
+              <w:rPr>
+                <w:sz w:val="20"/>
+              </w:rPr>
+              <w:t>Bias ~ 1/dt</w:t>
+            </w:r>
+          </w:p>
+        </w:tc>
+      </w:tr>
+      <w:tr>
+        <w:tc>
+          <w:tcPr>
+            <w:tcW w:type="dxa" w:w="1560"/>
+          </w:tcPr>
+          <w:p>
+            <w:r>
+              <w:rPr>
+                <w:sz w:val="20"/>
+              </w:rPr>
+              <w:t>0.020</w:t>
+            </w:r>
+          </w:p>
+        </w:tc>
+        <w:tc>
+          <w:tcPr>
+            <w:tcW w:type="dxa" w:w="1560"/>
+          </w:tcPr>
+          <w:p>
+            <w:r>
+              <w:rPr>
+                <w:sz w:val="20"/>
+              </w:rPr>
+              <w:t>180.0</w:t>
+            </w:r>
+          </w:p>
+        </w:tc>
+        <w:tc>
+          <w:tcPr>
+            <w:tcW w:type="dxa" w:w="1560"/>
+          </w:tcPr>
+          <w:p>
+            <w:r>
+              <w:rPr>
+                <w:sz w:val="20"/>
+              </w:rPr>
+              <w:t>102.0</w:t>
+            </w:r>
+          </w:p>
+        </w:tc>
+        <w:tc>
+          <w:tcPr>
+            <w:tcW w:type="dxa" w:w="1560"/>
+          </w:tcPr>
+          <w:p>
+            <w:r>
+              <w:rPr>
+                <w:sz w:val="20"/>
+              </w:rPr>
+              <w:t>144.7</w:t>
+            </w:r>
+          </w:p>
+        </w:tc>
+        <w:tc>
+          <w:tcPr>
+            <w:tcW w:type="dxa" w:w="1560"/>
+          </w:tcPr>
+          <w:p>
+            <w:r>
+              <w:rPr>
+                <w:sz w:val="20"/>
+              </w:rPr>
+              <w:t>102.3</w:t>
+            </w:r>
+          </w:p>
+        </w:tc>
+        <w:tc>
+          <w:tcPr>
+            <w:tcW w:type="dxa" w:w="1560"/>
+          </w:tcPr>
+          <w:p>
+            <w:r>
+              <w:rPr>
+                <w:sz w:val="20"/>
+              </w:rPr>
+              <w:t>Saturated</w:t>
+            </w:r>
+          </w:p>
+        </w:tc>
+      </w:tr>
+      <w:tr>
+        <w:tc>
+          <w:tcPr>
+            <w:tcW w:type="dxa" w:w="1560"/>
+          </w:tcPr>
+          <w:p>
+            <w:r>
+              <w:rPr>
+                <w:sz w:val="20"/>
+              </w:rPr>
+              <w:t>0.010</w:t>
+            </w:r>
+          </w:p>
+        </w:tc>
+        <w:tc>
+          <w:tcPr>
+            <w:tcW w:type="dxa" w:w="1560"/>
+          </w:tcPr>
+          <w:p>
+            <w:r>
+              <w:rPr>
+                <w:sz w:val="20"/>
+              </w:rPr>
+              <w:t>180.0</w:t>
+            </w:r>
+          </w:p>
+        </w:tc>
+        <w:tc>
+          <w:tcPr>
+            <w:tcW w:type="dxa" w:w="1560"/>
+          </w:tcPr>
+          <w:p>
+            <w:r>
+              <w:rPr>
+                <w:sz w:val="20"/>
+              </w:rPr>
+              <w:t>102.0</w:t>
+            </w:r>
+          </w:p>
+        </w:tc>
+        <w:tc>
+          <w:tcPr>
+            <w:tcW w:type="dxa" w:w="1560"/>
+          </w:tcPr>
+          <w:p>
+            <w:r>
+              <w:rPr>
+                <w:sz w:val="20"/>
+              </w:rPr>
+              <w:t>144.7</w:t>
+            </w:r>
+          </w:p>
+        </w:tc>
+        <w:tc>
+          <w:tcPr>
+            <w:tcW w:type="dxa" w:w="1560"/>
+          </w:tcPr>
+          <w:p>
+            <w:r>
+              <w:rPr>
+                <w:sz w:val="20"/>
+              </w:rPr>
+              <w:t>102.3</w:t>
+            </w:r>
+          </w:p>
+        </w:tc>
+        <w:tc>
+          <w:tcPr>
+            <w:tcW w:type="dxa" w:w="1560"/>
+          </w:tcPr>
+          <w:p>
+            <w:r>
+              <w:rPr>
+                <w:sz w:val="20"/>
+              </w:rPr>
+              <w:t>Saturated</w:t>
+            </w:r>
+          </w:p>
+        </w:tc>
+      </w:tr>
+    </w:tbl>
+    <w:p>
+      <w:r>
+        <w:t>Toy model: dx/dt = −k·(x−x₀) + FC_event, k=0.25, K=0.5, x_ceiling=180. Virtual Vet: 11-organ canine cardiovascular, DC=10 moderate hypoxia. Both systems show bias ∝ 1/dt in the unsaturated regime and saturation plateau at the physiological ceiling.</w:t>
+      </w:r>
+    </w:p>
+    <w:p>
+      <w:r>
+        <w:t>The agreement is qualitative but exact in pattern: in both systems, the buggy version produces bias that scales as ∝ 1/dt in the unsaturated regime (bias × dt = 1.90 ± 0.05 in the toy model, 1.14 ± 0.04 in Virtual Vet), and both systems plateau at a saturation ceiling when the state variable reaches its bound. The fixed versions in both cases converge to a dt-independent steady state.</w:t>
+      </w:r>
+    </w:p>
+    <w:p>
+      <w:r>
+        <w:t>The toy model contains no cardiovascular parameters — only a continuous relaxation (k = 0.25), a setpoint (x₀ = 100), a discrete event magnitude (K = 0.5), and a saturation ceiling (x_ceiling = 180). The fact that it reproduces the entire bias pattern (unsaturated drift, saturated plateau, dt invariance of the fixed version) is consistent with the hypothesis that the spurious steady state mechanism is intrinsic to the coupling pattern [13] — threshold-gated discrete events emitting dimensionless per-step increments into a continuously integrated state variable — rather than contingent on baroreflex physiology, multi-organ coupling, or any domain-specific detail. A single parameter set is illustrative rather than exhaustive; demonstrating generality across parameter regimes and alternative coupling architectures is a natural direction for further investigation.</w:t>
       </w:r>
     </w:p>
     <w:p>
@@ -1919,21 +2386,26 @@
       </w:r>
     </w:p>
     <w:p>
+      <w:r>
+        <w:t>We structure this discussion around three layers of generality. The specific 7-line fix corrects the bug in this codebase. The detection protocol (Section 4.2) generalizes to any modular simulation. The interface fix (Section 4.3) prevents the entire class of failure at the architecture level.</w:t>
+      </w:r>
+    </w:p>
+    <w:p>
       <w:pPr>
         <w:pStyle w:val="Heading3"/>
       </w:pPr>
       <w:r>
-        <w:t>4.1 Spurious Steady State: A Dangerous Failure Mode</w:t>
+        <w:t>4.1 The Anti-Pattern: dt-Dimensional Ambiguity in Discrete Events</w:t>
       </w:r>
     </w:p>
     <w:p>
       <w:r>
-        <w:t>The central finding of this study is that a dt-dimensional mismatch in discrete inter-module events can produce a stable, reproducible steady state that is physiologically incorrect — while passing all standard convergence diagnostics.</w:t>
+        <w:t>The central finding of this study is that a dt-dimensional ambiguity in discrete inter-module events can produce a stable, reproducible steady state that is physiologically incorrect — while passing all standard convergence diagnostics. We term this failure mode spurious steady state: a stable fixed point of the discrete system that does not correspond to any fixed point of the continuous-limit system, arising from a dt-dependent perturbation that vanishes as dt → 0 but produces a finite offset at any finite dt.</w:t>
       </w:r>
     </w:p>
     <w:p>
       <w:r>
-        <w:t>We term this failure mode spurious steady state. Formally: a stable fixed point of the discrete system that does not correspond to any fixed point of the continuous-limit system, arising from a dt-dependent perturbation that vanishes in the continuous limit but produces a finite offset at any discrete dt. Its defining characteristics are:</w:t>
+        <w:t>The spurious steady state has three defining characteristics:</w:t>
       </w:r>
     </w:p>
     <w:p>
@@ -1953,7 +2425,7 @@
     </w:p>
     <w:p>
       <w:r>
-        <w:t>Figure 1 illustrates the mechanism schematically. The erroneous discrete event pushes the true solution away from the correct fixed point at a drift rate ∝ 1/dt. Physiological saturation (HR ceiling at 180 bpm) eventually truncates this drift, creating a stable spurious fixed point at the saturation boundary.</w:t>
+        <w:t>The mechanism (Figure 1) is a general anti-pattern: Module A emits a value that modifies a continuous state in Module B, but the emission carries no information about whether the value is a rate (normalized to the integration step, unit/s) or an increment (per-step, unit/step). The receiving module cannot distinguish the two because the interface does not declare the temporal dimension. This ambiguity is the anti-pattern's root.</w:t>
       </w:r>
     </w:p>
     <w:p>
@@ -2002,7 +2474,47 @@
           <w:b/>
           <w:sz w:val="20"/>
         </w:rPr>
-        <w:t>Figure 1: Spurious steady state schematic. The true fixed point is destabilized by the dt-dimensional error; saturation creates a false steady state.</w:t>
+        <w:t>Figure 1 (see full schematic at end of manuscript).</w:t>
+      </w:r>
+    </w:p>
+    <w:p>
+      <w:r>
+        <w:t>Why the anti-pattern is dangerous — four escape conditions. In our case, the spurious steady state evaded detection through a confluence of four conditions, each independently sufficient to mislead standard diagnostics. Their conjunction explains the insidiousness:</w:t>
+      </w:r>
+    </w:p>
+    <w:p>
+      <w:r>
+        <w:t>- Condition 1 — Convergence blind spot from saturation. At dt ≤ 0.02 s, the HR ceiling (180 bpm) truncated the drift, producing a flat MAP vs dt curve. Standard dt refinement faithfully reports that the discrete solution has stabilized, but it cannot distinguish convergence to the correct fixed point from convergence to a spurious one created by a saturation boundary.</w:t>
+      </w:r>
+    </w:p>
+    <w:p>
+      <w:r>
+        <w:t>- Condition 2 — Module-level unit tests pass. Each organ module was individually correct. The error was not in any module but in the dimensional assumption at the coupling boundary. Cross-module dimensional consistency is not covered by unit testing.</w:t>
+      </w:r>
+    </w:p>
+    <w:p>
+      <w:r>
+        <w:t>- Condition 3 — Face validity of the output. MAP = 144.7 mmHg is elevated but plausible for a canine under stress. The output was a smooth, stable time series — no oscillations, no discontinuities — the hallmarks of numerical instability were entirely absent.</w:t>
+      </w:r>
+    </w:p>
+    <w:p>
+      <w:r>
+        <w:t>- Condition 4 — No standard V&amp;V step covers inter-module dimensional consistency. Code verification checks equation correctness; solution verification estimates discretization error; validation compares against reality. None checks whether a discrete event carries rate dimensions consistent with the receiving module's integration context [11].</w:t>
+      </w:r>
+    </w:p>
+    <w:p>
+      <w:r>
+        <w:t>The failure of any single condition — no physiological ceiling (removing Condition 1), or MAP reaching 300 mmHg (removing Condition 3) — would have triggered investigation. That all four held simultaneously created a perfect diagnostic blind spot.</w:t>
+      </w:r>
+    </w:p>
+    <w:p>
+      <w:r>
+        <w:t>Amplifier: parallel paths. A structural property of the architecture amplified the anti-pattern's hiding power. Two independent mechanisms targeted the same variable (heart_rate): the continuous baroreflex path and the discrete FactorCommand path. When one path was removed during testing, the other continued to provide drive, masking the dimensional error. In any modular simulation where multiple modules can write to the same state variable, redundant paths create a testing blind spot.</w:t>
+      </w:r>
+    </w:p>
+    <w:p>
+      <w:r>
+        <w:t>Generality. The toy model (Section 3.5) proves that this anti-pattern requires no physiological detail — only continuous integration + threshold-gated discrete events + a saturation boundary. The FactorCommand pattern (target, op, value) is domain-neutral, appearing in robotic control, co-simulation, and DEVS-based frameworks [3]. Any modular simulation with these ingredients is susceptible.</w:t>
       </w:r>
     </w:p>
     <w:p>
@@ -2010,32 +2522,32 @@
         <w:pStyle w:val="Heading3"/>
       </w:pPr>
       <w:r>
-        <w:t>4.2 Why Standard Diagnostics Failed</w:t>
+        <w:t>4.2 Detection Protocol: Three Levels</w:t>
       </w:r>
     </w:p>
     <w:p>
       <w:r>
-        <w:t>- dt refinement: In our experiments, halving dt from 0.01 to 0.005 s produced identical MAP (144.7 mmHg), giving no indication of remaining error.</w:t>
+        <w:t>The escape analysis above suggests three complementary detection methods, applicable to any modular simulation with discrete-event coupling:</w:t>
       </w:r>
     </w:p>
     <w:p>
       <w:r>
-        <w:t>- Steady-state detection: A moving-variance detector confirmed convergence within 30 s of simulation, well within the 60 s window.</w:t>
+        <w:t>Level 1 — Static dimensional linting (code time). Every discrete event emission point should be checked at code time: if the value is additive, it must contain a dt factor (rate, unit/s) rather than being a bare increment (unit/step); if multiplicative, it must be exponentiated by dt or expressed as 1 + rate × dt. We have released a static lint tool (check_fc_dimensions.py) that automates this check for the FactorCommand pattern, and it successfully detected a second latent issue in the immune module after the primary fix.</w:t>
       </w:r>
     </w:p>
     <w:p>
       <w:r>
-        <w:t>- Parameter sweeps: Eight-fold baroreflex gain sweeps (0.5× to 8.0×), MAP initialization sweeps, and body mass sweeps all left the bias unchanged — not because the mechanism is robust, but because the spurious steady state had already saturated at the HR ceiling.</w:t>
+        <w:t>Level 2 — Runtime dt-sweep audit (integration time). A wrapper procedure: run the simulation at dt, 2dt, 4dt, and 8dt, and compute |SS(dt) − SS(8dt)|. If the relative variation exceeds 1% for any key output, flag for dimensional review. In our data, the buggy engine showed MAP range 33.7 mmHg (&gt;30% variation across dt) at DC=10 (Table 1: 144.7 − 111.0), while the fixed engine showed MAP range 0.51 mmHg (&lt;1%) under the same conditions (Table 3, Z_range). This test directly targets the signature of dimensional inconsistency — systematic drift with step size — with minimal implementation effort.</w:t>
       </w:r>
     </w:p>
     <w:p>
       <w:r>
-        <w:t>- Ordering swap: The swap test (heart→neuro vs neuro→heart) showed identical results in subprocess-isolated runs (Δ &lt; 0.034 mmHg), giving false confidence in the sequential coupling architecture.</w:t>
+        <w:t>Level 3 — Interface contract metadata (design time). The most fundamental level: make the temporal dimension of every discrete event a first-class part of the interface (see Section 4.3 for detailed discussion). Levels 1 and 2 detect existing errors; Level 3 prevents them from being introduced.</w:t>
       </w:r>
     </w:p>
     <w:p>
       <w:r>
-        <w:t>The dt sweep itself revealed the anomaly — MAP was observed to increase monotonically with decreasing dt — but this pattern was misinterpreted as saturation at the HR physiological ceiling. Only after dimensional analysis traced the mechanism to FactorCommand emission did the true cause become apparent. This is the insidious part: the error did register in the data, but was dismissed as an expected physiological limit rather than an implementation artifact. An independent implicit solver (Radau) confirmed the misclassification after the fact, but the more important lesson is that standard diagnostics produced no warning — they only failed to assign the correct cause.</w:t>
+        <w:t>Negative result that is itself diagnostic. An important finding is what does NOT help: ordering swap tests (heart→neuro vs neuro→heart) showed Δ &lt; 0.034 mmHg, which might suggest the architecture is insensitive to coupling effects. It is not — the swap test is simply not diagnostic for dimensional errors. Ordering sensitivity and dimensional inconsistency are distinct failure modes; the absence of one does not rule out the other.</w:t>
       </w:r>
     </w:p>
     <w:p>
@@ -2043,17 +2555,58 @@
         <w:pStyle w:val="Heading3"/>
       </w:pPr>
       <w:r>
-        <w:t>4.3 The dt-Dimensional Trap</w:t>
+        <w:t>4.3 The Interface Fix: Preventing the Class</w:t>
       </w:r>
     </w:p>
     <w:p>
       <w:r>
-        <w:t>The root cause was a unit mismatch: the neuro module emitted HR increments in bpm-per-timestep, but the receiving code implicitly treated the value as bpm-per-second. Its insidiousness lies in the fact that at a single dt value, the error is invisible. A simulation run only at dt = 0.01 s would produce MAP = 144.7 mmHg with no indication of pathology. The error manifests only when dt is varied and the bias is observed to increase with decreasing step size — a sufficiently counterintuitive pattern that many researchers would attribute to other causes (model stiffness, solver stability) before considering a dimensional inconsistency in discrete events.</w:t>
+        <w:t>The 7-line code change described in Section 3.4 (multiplying FC deltas by dt) fixes this specific instance, but it is a case-specific remedy, not a class-level prevention. The bug was possible because the FactorCommand interface carried no information about the temporal interpretation of the value. The fix that prevents the entire class of failure is to make temporal type a first-class component of the inter-module interface contract.</w:t>
       </w:r>
     </w:p>
     <w:p>
       <w:r>
-        <w:t>Threshold gating compounds the problem. When the chemoreceptor drive is near threshold, small changes in the state trajectory can push the emission on or off, creating a discontinuous mapping between dt and total injected HR. This makes the bias pattern irregular across the dt sweep in the unsaturated regime, further obscuring the underlying monotonic relationship.</w:t>
+        <w:t>Proposal: temporal type annotation on discrete events. Every discrete event type should declare whether its value is a rate (normalized to the integration step) or an increment (per-step):</w:t>
+      </w:r>
+    </w:p>
+    <w:p>
+      <w:pPr>
+        <w:spacing w:line="240" w:lineRule="auto"/>
+      </w:pPr>
+      <w:r>
+        <w:rPr>
+          <w:rFonts w:ascii="Courier New" w:hAnsi="Courier New"/>
+          <w:sz w:val="18"/>
+        </w:rPr>
+        <w:t>@dataclass</w:t>
+        <w:br/>
+        <w:t>class DiscreteEvent:</w:t>
+        <w:br/>
+        <w:t xml:space="preserve">    target: str</w:t>
+        <w:br/>
+        <w:t xml:space="preserve">    op: Literal["add", "multiply"]</w:t>
+        <w:br/>
+        <w:t xml:space="preserve">    value: float</w:t>
+        <w:br/>
+        <w:t xml:space="preserve">    # Temporal metadata (proposed)</w:t>
+        <w:br/>
+        <w:t xml:space="preserve">    temporal_type: Literal["rate", "increment"]  # per-second vs per-step</w:t>
+        <w:br/>
+        <w:t xml:space="preserve">    unit: str                                     # bpm, mmHg, L/min ...</w:t>
+      </w:r>
+    </w:p>
+    <w:p>
+      <w:r>
+        <w:t>With this declaration, the simulation engine's dispatch layer enforces the constraint at runtime: a "rate" event that has not been scaled by dt before reaching the application point is flagged. At design time, the annotation makes the temporal dimension explicit in code review. At code time, a lint rule (Level 1) verifies consistency between the declared temporal_type and the actual expression producing value.</w:t>
+      </w:r>
+    </w:p>
+    <w:p>
+      <w:r>
+        <w:t>Why existing interface standards are insufficient. The Functional Mock-up Interface (FMI) [14] — the dominant standard for modular simulation — annotates every variable with physical units via the BaseUnit element (kg, m, s, etc.). When two variables are connected, FMI checks that their exponent vectors match, catching mismatches such as connecting a force (kg·m/s²) to an angle (rad). This is valuable, but it cannot distinguish a rate (bpm/s) from an increment (bpm/step) because both share the physical dimension 1/time — the distinction is not in the SI unit system but in whether the value is normalized by the integration step size. Nutaro et al. [13] identified this same limitation in their analysis of time representation in hybrid co-simulation and proposed FMI-HC extensions using integer time and absent signals for discrete event handling — a complementary direction that addresses temporal resolution but, like the base FMI standard, does not capture the rate-versus-increment dimension. Modelica's unit checking [15], the most advanced dimensional inference in simulation software, similarly operates on physical dimensions only.</w:t>
+      </w:r>
+    </w:p>
+    <w:p>
+      <w:r>
+        <w:t>The temporal_type annotation fills this gap. It addresses a dimension — rate vs increment — that the SI system does not express and that existing interface standards do not capture. This is a natural extension of the design-by-contract principle [16] applied to simulation coupling: the interface should specify not just what physical quantity is exchanged, but how its value is temporally qualified relative to the integration process.</w:t>
       </w:r>
     </w:p>
     <w:p>
@@ -2061,42 +2614,27 @@
         <w:pStyle w:val="Heading3"/>
       </w:pPr>
       <w:r>
-        <w:t>4.4 Lessons for Modular ODE Simulation</w:t>
+        <w:t>4.4 Relationship to Prior Work</w:t>
       </w:r>
     </w:p>
     <w:p>
       <w:r>
-        <w:t>Lesson 1: Dimensional consistency must be explicit. Any discrete event that modifies a continuous state variable must carry consistent rate dimensions. The convention of "per-step" quantities, common in game engines and real-time simulation, is a latent source of dt-dependent error in scientific ODE simulation. We recommend that all inter-module communication quantities be explicitly annotated with their dimensions in code comments.</w:t>
+        <w:t>Our results complement and extend previous findings on numerical bias in physiological simulation. Tłałka et al. [5] reported that explicit Euler methods are "numerically unstable" for baroreflex models; we identify a specific, preventable mechanism for this instability — not a fundamental property of explicit Euler, but a dimensional error in discrete inter-module events.</w:t>
       </w:r>
     </w:p>
     <w:p>
       <w:r>
-        <w:t>Lesson 2: Parallel paths mask bugs. The existence of two independent mechanisms targeting the same variable (heart_rate) allowed the dimensional error to go unnoticed: when one path was removed during testing, the other continued to provide drive. Modular simulation engines should audit for redundant targeting paths and, at minimum, document which path is intended to dominate under which conditions.</w:t>
+        <w:t>The spurious steady state phenomenon is distinct from the splitting error analyzed by Kim et al. [12] in poromechanics. In Kim's analysis, the error arises from the mathematical structure of the operator split and persists as dt → 0 — an intrinsic property of the sequential coupling scheme. In our case, the error would vanish if the discrete event were correctly normalized; it is a dimensional inconsistency in the event emission protocol, not a fundamental limitation of sequential integration. The distinction is important: Kim's error requires architectural changes (e.g., monolithic coupling) to eliminate, whereas ours requires only an interface-level temporal annotation.</w:t>
       </w:r>
     </w:p>
     <w:p>
       <w:r>
-        <w:t>Lesson 3: Spurious steady states require specific detection strategies. Standard diagnostics are insufficient. We recommend:</w:t>
+        <w:t>Co-simulation coupling error research [17, 18] addresses errors from discrete-time information exchange — input extrapolation, signal reconstruction, energy artifacts at macro-step boundaries. These are temporal discretization artifacts, distinct from the temporal dimensional ambiguity we identify. The former concerns when information is exchanged; the latter concerns what temporal interpretation the exchanged value carries.</w:t>
       </w:r>
     </w:p>
     <w:p>
       <w:r>
-        <w:t>- Routine dt sweeps with at least one order of magnitude in both directions from the operating dt</w:t>
-      </w:r>
-    </w:p>
-    <w:p>
-      <w:r>
-        <w:t>- Explicit monitoring of all state variables approaching physiological saturation limits</w:t>
-      </w:r>
-    </w:p>
-    <w:p>
-      <w:r>
-        <w:t>- Where possible, comparison against an independent solver (implicit or unified state-vector) at a single dt value</w:t>
-      </w:r>
-    </w:p>
-    <w:p>
-      <w:r>
-        <w:t>Lesson 4: Order swap tests are not diagnostic. The equivalence of heart→neuro and neuro→heart orderings (Δ &lt; 0.034 mmHg in subprocess-isolated tests) shows that sequential coupling is not the source of bias. Before attributing systematic error to algorithmic architecture, exclude dimensional errors in discrete events.</w:t>
+        <w:t>Nutaro et al. [13] proposed a split system approach for managing time in hybrid simulations combining continuous and discrete-event components, classifying hybrid systems into essentially continuous, essentially discrete, and truly hybrid — where applying standard packages leads to inaccuracies. Their constructive methodology uses a priori knowledge of model structure to decompose and re-articulate hybrid systems for existing simulation tools. Our work complements theirs from the diagnostic direction: where Nutaro provides a design methodology for getting hybrid time management right, we document a specific failure mode that arises when it goes wrong and propose the temporal type metadata that would make such failures detectable at the interface level.</w:t>
       </w:r>
     </w:p>
     <w:p>
@@ -2104,40 +2642,32 @@
         <w:pStyle w:val="Heading3"/>
       </w:pPr>
       <w:r>
-        <w:t>4.5 Relationship to Prior Work</w:t>
+        <w:t>4.5 Limitations and Cross-Engine Audit</w:t>
       </w:r>
     </w:p>
     <w:p>
       <w:r>
-        <w:t>Our results complement and extend previous findings on numerical bias in physiological simulation. Tłałka et al. (2024) reported that explicit Euler methods are "numerically unstable" for baroreflex models; we identify a specific, preventable mechanism for this instability — not a fundamental property of explicit Euler, but a dimensional error in discrete inter-module events.</w:t>
+        <w:t>This study has several limitations. First, the Virtual Vet results are from a single simulation platform. The toy model (Section 3.5) confirms the spurious steady state pattern is intrinsic to the coupling design rather than platform-specific, but whether it manifests in other production-grade engines remains to be systematically investigated. Second, the clinical validation is limited to comparison with a single published canine hypoxia study; a broader validation against multiple physiological scenarios is warranted. Third, the hemorrhage-induced ordering sensitivity (Δ = 2.84 mmHg during transient) is a genuine property of the sequential Euler architecture that persists after the dt-scaling fix; it represents a separate, unresolved issue outside the scope of the present work. Fourth, the Y/Z isolation confound (Section 3.4 note) limits the precision of the B_contrib attribution, though it does not affect the primary finding that Operation A alone eliminates the bias.</w:t>
       </w:r>
     </w:p>
     <w:p>
       <w:r>
-        <w:t>The spurious steady state phenomenon is distinct from the splitting error analyzed by Kim et al. (2011) in poromechanics. In Kim's framework, the splitting error arises from the mathematical structure of the operator split and persists as dt → 0. In our case, the error would vanish if the discrete event were correctly normalized — it is an implementation error, not a mathematical necessity.</w:t>
-      </w:r>
-    </w:p>
-    <w:p>
-      <w:pPr>
-        <w:pStyle w:val="Heading3"/>
-      </w:pPr>
-      <w:r>
-        <w:t>4.6 Limitations</w:t>
+        <w:t>Cross-engine survey. We examined the architectural documentation of three production-grade physiological simulation engines for analogous threshold-gated discrete event patterns. HumMod [19] — a 5,000-variable integrative physiology model written in C++ with XML-defined equations — uses a continuous ODE solver with no per-step discrete event emission mechanism; its XML schema defines differential equations and algebraic relationships, not event-driven increments. CellML/Chaste [20] auto-generates solver code from CellML XML descriptions that include mandatory unit annotations; the code generator produces time-normalized increments automatically, and dimensional consistency is enforced at the schema level. The HOM Human Physiology Model [21], a Java-based educational simulator, similarly employs continuous integration without threshold-gated discrete events.</w:t>
       </w:r>
     </w:p>
     <w:p>
       <w:r>
-        <w:t>This study has several limitations. First, the results are from a single simulation platform; the generality of the spurious steady state pattern across other modular ODE engines requires further investigation. Second, the clinical validation is limited to comparison with a single published canine hypoxia study; a broader validation against multiple physiological scenarios is warranted. Third, the hemorrhage-induced ordering sensitivity (Δ = 2.84 mmHg during transient) is a genuine property of the sequential Euler architecture that persists after the dt-scaling fix; it represents a separate, unresolved issue outside the scope of the present work. Fourth, the Y/Z isolation confound (Section 3.4 note) limits the precision of the B_contrib attribution, though it does not affect the primary finding that Operation A alone eliminates the bias.</w:t>
+        <w:t>This negative result is consistent with our analysis: the spurious steady state requires three simultaneous ingredients — (i) threshold-gated discrete events, (ii) per-step increments without dt normalization, and (iii) a saturation boundary that creates a false convergence signal. Large-scale physiological engines typically avoid ingredient (ii) by design: they either use continuous ODE solvers (HumMod, HOM) or enforce unit consistency through schema-level constraints (CellML). The failure mode is therefore most likely to arise in custom-built modular simulators — particularly those developed incrementally by domain scientists without formal training in M&amp;S — where discrete event interfaces evolve organically without explicit temporal type specifications.</w:t>
+      </w:r>
+    </w:p>
+    <w:p>
+      <w:r>
+        <w:t>This finding has a practical implication: rather than treating cross-engine generalizability as an open question, we propose it as a targeted audit criterion. Any modular simulator with threshold-gated discrete events that does not enforce temporal type metadata at the interface level should be flagged for dimensional review of its event emissions.</w:t>
       </w:r>
     </w:p>
     <w:p>
       <w:r>
         <w:t>All simulations use IEEE 754 double-precision arithmetic. The subprocess-isolated cross-run agreement (Δ = 0.034 mmHg, Section 3.2) confirms that floating-point accumulation order does not affect the reported results at the precision level relevant to this study.</w:t>
-      </w:r>
-    </w:p>
-    <w:p>
-      <w:r>
-        <w:t>Data and code availability: The Virtual Vet simulation engine, experiment scripts (exp6–exp9), and experimental data (JSON files) are available at https://github.com/ningjie333/virtual-vet. All experiments can be reproduced by running the Python scripts in the experiments/ directory with Python 3.13+ and the dependencies listed in pyproject.toml.</w:t>
       </w:r>
     </w:p>
     <w:p>
@@ -2150,17 +2680,30 @@
     </w:p>
     <w:p>
       <w:r>
-        <w:t>We documented the discovery, diagnosis, and correction of a dimensional analysis error in one FactorCommand channel of the Virtual Vet canine cardiovascular simulation: a heart rate modifier was implemented as a fixed per-step increment (bpm/step) rather than a time-normalized rate (bpm/s), producing a steady-state MAP bias of +44.7 mmHg that standard convergence diagnostics could not detect. The bias scaled as ∝ 1/dt before saturating at the HR physiological ceiling of 180 bpm, creating a spurious steady state — a stable steady state at a physiologically wrong operating point.</w:t>
+        <w:t>We characterized spurious steady state — a failure mode in which threshold-gated discrete events carrying dt-dimensional ambiguity (per-step increment vs per-second rate) produce a stable but incorrect steady state that standard convergence diagnostics cannot detect. The mode was discovered in the Virtual Vet canine cardiovascular simulation, where a heart rate modifier implemented as a fixed increment (bpm/step) produced a MAP bias of +44.7 mmHg scaling as ∝ 1/dt before saturating at the HR physiological ceiling.</w:t>
       </w:r>
     </w:p>
     <w:p>
       <w:r>
-        <w:t>The correction required 7 lines of code: scaling discrete deltas by dt and eliminating a redundant parallel path. Post-fix, MAP variance across a dt sweep fell from 44.7 mmHg to ≤2.21 mmHg. A three-condition isolation experiment confirmed that the FC dt-scaling (Operation A) accounts for virtually all of the improvement; the parallel redundant-path removal (Operation B) is physiologically motivated but does not materially alter the convergence metric.</w:t>
+        <w:t>The contribution is threefold. First, we identify the anti-pattern: dimensional ambiguity in discrete-event interfaces — the coupling interface does not declare whether a transmitted value is a rate or an increment. This anti-pattern evades detection through four simultaneous escape conditions (saturation blind spot, passing module tests, plausible output, and cross-module dimensions outside standard V&amp;V scope). Second, we propose a three-level detection protocol: static dimensional linting (code time), dt-sweep audit (integration time), and interface contract metadata (design time). Third, the fundamental interface fix is not the 7-line dt-scaling correction but the addition of temporal type metadata to the discrete-event interface contract — a dimension that existing standards (FMI, Modelica) do not cover.</w:t>
       </w:r>
     </w:p>
     <w:p>
       <w:r>
-        <w:t>This case study is specific to the HR-additive FactorCommand in Virtual Vet. The SVR-multiplicative FactorCommand has an analogous dt-dependency that was corrected in the same code change using exponential rate conversion (SVR_new = SVR × net_SVR_mult^dt). Developers of similar modular ODE engines are advised to explicitly verify the dimensional consistency of all discrete inter-module events — a per-step quantity not normalized by dt carries a hidden dt-dependence that routine convergence checks will not reveal. Whether this failure pattern recurs in other physiological simulation platforms is an open question warranting systematic investigation.</w:t>
+        <w:t>A cross-engine architectural survey of HumMod, CellML/Chaste, and HOM found no analogous threshold-gated discrete event patterns: these engines employ continuous ODE solvers or unit-enforced schema-level code generation that structurally prevent this class of error. This negative result is consistent with our analysis: the failure mode requires three simultaneous ingredients — threshold-gated events, per-step increments without dt normalization, and a saturation boundary — and is most likely to arise in custom-built modular simulators developed incrementally without explicit temporal type specifications. We propose dimensional audit of discrete-event emissions as a targeted V&amp;V criterion for any such simulator.</w:t>
+      </w:r>
+    </w:p>
+    <w:p>
+      <w:pPr>
+        <w:pStyle w:val="Heading2"/>
+      </w:pPr>
+      <w:r>
+        <w:t>Acknowledgments</w:t>
+      </w:r>
+    </w:p>
+    <w:p>
+      <w:r>
+        <w:t>This research did not receive any specific grant from funding agencies in the public, commercial, or not-for-profit sectors.</w:t>
       </w:r>
     </w:p>
     <w:p>
@@ -2173,47 +2716,107 @@
     </w:p>
     <w:p>
       <w:r>
-        <w:t>1. van Osta N, Van Den Acker G, Van Loon T, Arts T, Delhaas T, Lumens J. Numerical accuracy of closed-loop steady state in a zero-dimensional cardiovascular model. Phil Trans R Soc A. 2025.</w:t>
+        <w:t>1. Ottesen JT, Olufsen MS, Larsen JK. Applied Mathematical Models in Human Physiology. SIAM; 2004.</w:t>
       </w:r>
     </w:p>
     <w:p>
       <w:r>
-        <w:t>2. Tłałka K, Saxton H, Halliday I, Xu X et al. Sensitivity analysis of closed-loop one-chamber and four-chamber models with baroreflex. PLOS Computational Biology. 2024. doi:10.1371/journal.pcbi.1012377</w:t>
+        <w:t>2. Causin P, Gerbeau JF, Nobile F. Added-mass effect in the design of partitioned algorithms for fluid-structure problems. Comput Methods Appl Mech Engrg. 2005;194(42-44):4506–4527.</w:t>
       </w:r>
     </w:p>
     <w:p>
       <w:r>
-        <w:t>3. Ursino M. Interaction between carotid baroregulation and the pulsating heart: a mathematical model. Am J Physiol Heart Circ Physiol. 1998;275(44):H382–H398.</w:t>
+        <w:t>3. Zeigler BP, Praehofer H, Kim TG. Theory of Modeling and Simulation. 2nd ed. Academic Press; 2000.</w:t>
       </w:r>
     </w:p>
     <w:p>
       <w:r>
-        <w:t>4. Kim J, Tchelepi HA, Juanes R. Stability and convergence of sequential methods for coupled flow and geomechanics: Drained and undrained splits. Comput Methods Appl Mech Engrg. 2011;200(23-24):2611–2626.</w:t>
+        <w:t>4. van Osta N, Van Den Acker G, Van Loon T, Arts T, Delhaas T, Lumens J. Numerical accuracy of closed-loop steady state in a zero-dimensional cardiovascular model. Phil Trans R Soc A. 2025.</w:t>
       </w:r>
     </w:p>
     <w:p>
       <w:r>
-        <w:t>5. Tucker A, Stager JM, Cordova-Salinas M. Oxygen uptake and heart rate responses to graded hypoxia in conscious dogs. Am J Vet Res. 1984;45(7):1343–1346.</w:t>
+        <w:t>5. Tłałka K, Saxton H, Halliday I, Xu X et al. Sensitivity analysis of closed-loop one-chamber and four-chamber models with baroreflex. PLOS Computational Biology. 2024. doi:10.1371/journal.pcbi.1012377</w:t>
       </w:r>
     </w:p>
     <w:p>
       <w:r>
-        <w:t>6. Hairer E, Wanner G. Solving Ordinary Differential Equations II: Stiff and Differential-Algebraic Problems. 2nd ed. Springer; 1996.</w:t>
+        <w:t>6. Ursino M. Interaction between carotid baroregulation and the pulsating heart: a mathematical model. Am J Physiol Heart Circ Physiol. 1998;275(44):H382–H398.</w:t>
       </w:r>
     </w:p>
     <w:p>
       <w:r>
-        <w:t>7. Causin P, Gerbeau JF, Nobile F. Added-mass effect in the design of partitioned algorithms for fluid-structure problems. Comput Methods Appl Mech Engrg. 2005;194(42-44):4506–4527.</w:t>
+        <w:t>7. Hairer E, Wanner G. Solving Ordinary Differential Equations II: Stiff and Differential-Algebraic Problems. 2nd ed. Springer; 1996.</w:t>
       </w:r>
     </w:p>
     <w:p>
       <w:r>
-        <w:t>8. Ottesen JT, Olufsen MS, Larsen JK. Applied Mathematical Models in Human Physiology. SIAM; 2004.</w:t>
+        <w:t>8. Acierno MJ, Brown S, Coleman AE et al. ACVIM consensus statement: Guidelines for the identification, evaluation, and management of systemic hypertension in dogs and cats. J Vet Intern Med. 2018;32(6):1802–1822.</w:t>
       </w:r>
     </w:p>
     <w:p>
       <w:r>
-        <w:t>9. Acierno MJ, Brown S, Coleman AE et al. ACVIM consensus statement: Guidelines for the identification, evaluation, and management of systemic hypertension in dogs and cats. J Vet Intern Med. 2018;32(6):1802–1822.</w:t>
+        <w:t>9. VetFolio. Arterial blood pressure measurement. VetFolio Clinical Resource. Available at: &lt;https://www.vetfolio.com/learn/article/arterial-blood-pressure-measurement&gt;</w:t>
+      </w:r>
+    </w:p>
+    <w:p>
+      <w:r>
+        <w:t>10. Tucker A, Stager JM, Cordova-Salinas M. Oxygen uptake and heart rate responses to graded hypoxia in conscious dogs. Am J Vet Res. 1984;45(7):1343–1346.</w:t>
+      </w:r>
+    </w:p>
+    <w:p>
+      <w:r>
+        <w:t>11. Oberkampf WL, Roy CJ. Verification and Validation in Scientific Computing. Cambridge University Press; 2010.</w:t>
+      </w:r>
+    </w:p>
+    <w:p>
+      <w:r>
+        <w:t>12. Kim J, Tchelepi HA, Juanes R. Stability and convergence of sequential methods for coupled flow and geomechanics: Drained and undrained splits. Comput Methods Appl Mech Engrg. 2011;200(23-24):2611–2626.</w:t>
+      </w:r>
+    </w:p>
+    <w:p>
+      <w:r>
+        <w:t>13. Nutaro J, Kuruganti PT, Protopopescu V, Shankar M. The split system approach to managing time in simulations of hybrid systems having continuous and discrete event components. SIMULATION. 2012;88(3):281–298. doi:10.1177/0037549711401000</w:t>
+      </w:r>
+    </w:p>
+    <w:p>
+      <w:r>
+        <w:t>14. Modelica Association. Functional Mock-up Interface Specification 3.0. 2023. Available at: &lt;https://fmi-standard.org/docs/3.0/&gt;</w:t>
+      </w:r>
+    </w:p>
+    <w:p>
+      <w:r>
+        <w:t>15. Broman D, Aronsson P, Fritzson P. Design Considerations for Dimensional Inference and Unit Consistency Checking in Modelica. Proc 6th International Modelica Conference. 2008; 1:1–10.</w:t>
+      </w:r>
+    </w:p>
+    <w:p>
+      <w:r>
+        <w:t>16. Meyer B. Object-Oriented Software Construction. 2nd ed. Prentice Hall; 1997.</w:t>
+      </w:r>
+    </w:p>
+    <w:p>
+      <w:r>
+        <w:t>17. Benedikt M, Watzenig D, Zehetner J. Relaxing the Step Size in Co-Simulation: Error Estimation and Adaptive Control. In: Co-Simulation of Dynamic Systems. Springer; 2019.</w:t>
+      </w:r>
+    </w:p>
+    <w:p>
+      <w:r>
+        <w:t>18. Gonzalez F, Bayod AA. Energy-based monitoring and correction to enhance the accuracy and stability of explicit co-simulation. Multibody System Dynamics. 2022; 56:1–28.</w:t>
+      </w:r>
+    </w:p>
+    <w:p>
+      <w:r>
+        <w:t>19. Hester RL, Iliescu R, Summers R, Coleman TG. Systems biology and integrative physiological modelling. J Physiol. 2011;589(5):1053–1060. doi:10.1113/jphysiol.2010.201533</w:t>
+      </w:r>
+    </w:p>
+    <w:p>
+      <w:r>
+        <w:t>20. Cooper J, Mirams GR, Sherwin SA, Pitt-Francis JM. Chaste: Cancer, Heart and Soft Tissue Environment. J Open Res Softw. 2013;1(1):e3. doi:10.5334/jors.ai</w:t>
+      </w:r>
+    </w:p>
+    <w:p>
+      <w:r>
+        <w:t>21. HOM Human Physiology Model. Available at: &lt;https://homphysiology.org/home.html&gt;</w:t>
       </w:r>
     </w:p>
     <w:p>
@@ -2230,14 +2833,14 @@
           <w:b/>
           <w:sz w:val="20"/>
         </w:rPr>
-        <w:t>Figure 1: Spurious steady state schematic — drift and saturation mechanism</w:t>
+        <w:t>Figure 1: Spurious steady state schematic — mechanism flow from true fixed point through drift to spurious steady state via HR saturation ceiling</w:t>
       </w:r>
     </w:p>
     <w:p>
       <w:r>
         <w:drawing>
           <wp:inline xmlns:a="http://schemas.openxmlformats.org/drawingml/2006/main" xmlns:pic="http://schemas.openxmlformats.org/drawingml/2006/picture">
-            <wp:extent cx="5029200" cy="3197308"/>
+            <wp:extent cx="5029200" cy="3472742"/>
             <wp:docPr id="1" name="Picture 1"/>
             <wp:cNvGraphicFramePr>
               <a:graphicFrameLocks noChangeAspect="1"/>
@@ -2258,7 +2861,7 @@
                   <pic:spPr>
                     <a:xfrm>
                       <a:off x="0" y="0"/>
-                      <a:ext cx="5029200" cy="3197308"/>
+                      <a:ext cx="5029200" cy="3472742"/>
                     </a:xfrm>
                     <a:prstGeom prst="rect"/>
                   </pic:spPr>
@@ -2275,14 +2878,14 @@
           <w:b/>
           <w:sz w:val="20"/>
         </w:rPr>
-        <w:t>Figure 2: MAP bias vs dt (log-log) — pre-fix, three regimes</w:t>
+        <w:t>Figure 2: MAP bias vs dt (log-log) — pre-fix, three regimes: unsaturated drift (bias ∝ 1/dt), saturation plateau (MAP = 144.7 mmHg), and the dimensional analysis confirming bias × dt ≈ const</w:t>
       </w:r>
     </w:p>
     <w:p>
       <w:r>
         <w:drawing>
           <wp:inline xmlns:a="http://schemas.openxmlformats.org/drawingml/2006/main" xmlns:pic="http://schemas.openxmlformats.org/drawingml/2006/picture">
-            <wp:extent cx="5029200" cy="1957118"/>
+            <wp:extent cx="5029200" cy="2144952"/>
             <wp:docPr id="2" name="Picture 2"/>
             <wp:cNvGraphicFramePr>
               <a:graphicFrameLocks noChangeAspect="1"/>
@@ -2303,7 +2906,7 @@
                   <pic:spPr>
                     <a:xfrm>
                       <a:off x="0" y="0"/>
-                      <a:ext cx="5029200" cy="1957118"/>
+                      <a:ext cx="5029200" cy="2144952"/>
                     </a:xfrm>
                     <a:prstGeom prst="rect"/>
                   </pic:spPr>
@@ -2320,14 +2923,14 @@
           <w:b/>
           <w:sz w:val="20"/>
         </w:rPr>
-        <w:t>Figure 3: Code diff — the 7-line fix</w:t>
+        <w:t>Figure 3: Code diff — the 7-line fix: FC dt-scaling (A), chemo path consolidation (B), and SVR exponential rate conversion (C)</w:t>
       </w:r>
     </w:p>
     <w:p>
       <w:r>
         <w:drawing>
           <wp:inline xmlns:a="http://schemas.openxmlformats.org/drawingml/2006/main" xmlns:pic="http://schemas.openxmlformats.org/drawingml/2006/picture">
-            <wp:extent cx="5029200" cy="2761351"/>
+            <wp:extent cx="5029200" cy="2716701"/>
             <wp:docPr id="3" name="Picture 3"/>
             <wp:cNvGraphicFramePr>
               <a:graphicFrameLocks noChangeAspect="1"/>
@@ -2348,7 +2951,7 @@
                   <pic:spPr>
                     <a:xfrm>
                       <a:off x="0" y="0"/>
-                      <a:ext cx="5029200" cy="2761351"/>
+                      <a:ext cx="5029200" cy="2716701"/>
                     </a:xfrm>
                     <a:prstGeom prst="rect"/>
                   </pic:spPr>
@@ -2361,62 +2964,20 @@
     </w:p>
     <w:p>
       <w:r>
-        <w:rPr>
-          <w:b/>
-          <w:sz w:val="20"/>
-        </w:rPr>
-        <w:t>Figure 4: Before/after comparison — X/Y/Z MAP range bar chart across DC conditions</w:t>
+        <w:t>Table 3 and Table 4 provide the quantitative comparison data for the isolation experiment and toy model, respectively, replacing the bar chart and side-by-side plot previously shown as Figures 4 and 5.</w:t>
+      </w:r>
+    </w:p>
+    <w:p>
+      <w:pPr>
+        <w:pStyle w:val="Heading2"/>
+      </w:pPr>
+      <w:r>
+        <w:t>Data and Code Availability</w:t>
       </w:r>
     </w:p>
     <w:p>
       <w:r>
-        <w:drawing>
-          <wp:inline xmlns:a="http://schemas.openxmlformats.org/drawingml/2006/main" xmlns:pic="http://schemas.openxmlformats.org/drawingml/2006/picture">
-            <wp:extent cx="5029200" cy="2796829"/>
-            <wp:docPr id="4" name="Picture 4"/>
-            <wp:cNvGraphicFramePr>
-              <a:graphicFrameLocks noChangeAspect="1"/>
-            </wp:cNvGraphicFramePr>
-            <a:graphic>
-              <a:graphicData uri="http://schemas.openxmlformats.org/drawingml/2006/picture">
-                <pic:pic>
-                  <pic:nvPicPr>
-                    <pic:cNvPr id="0" name="fig4_before_after_comparison.png"/>
-                    <pic:cNvPicPr/>
-                  </pic:nvPicPr>
-                  <pic:blipFill>
-                    <a:blip r:embed="rId12"/>
-                    <a:stretch>
-                      <a:fillRect/>
-                    </a:stretch>
-                  </pic:blipFill>
-                  <pic:spPr>
-                    <a:xfrm>
-                      <a:off x="0" y="0"/>
-                      <a:ext cx="5029200" cy="2796829"/>
-                    </a:xfrm>
-                    <a:prstGeom prst="rect"/>
-                  </pic:spPr>
-                </pic:pic>
-              </a:graphicData>
-            </a:graphic>
-          </wp:inline>
-        </w:drawing>
-      </w:r>
-    </w:p>
-    <w:p>
-      <w:r>
-        <w:t>Corresponding author: [Name], [Institution], [Email]</w:t>
-      </w:r>
-    </w:p>
-    <w:p>
-      <w:r>
-        <w:t>Competing interests: None declared.</w:t>
-      </w:r>
-    </w:p>
-    <w:p>
-      <w:r>
-        <w:t>Funding: [Funding source]</w:t>
+        <w:t>The Virtual Vet simulation engine, experiment scripts (exp6–exp9), and experimental data (JSON files) are available at &lt;https://github.com/ningjie333/virtual-vet&gt;. All experiments can be reproduced by running the Python scripts in the experiments/ directory with Python 3.13+ and the dependencies listed in pyproject.toml. The static lint tool check_fc_dimensions.py is included in the repository under tools/.</w:t>
       </w:r>
     </w:p>
     <w:sectPr>

</xml_diff>